<commit_message>
cleaning up old image files
</commit_message>
<xml_diff>
--- a/5-19-26.docx
+++ b/5-19-26.docx
@@ -315,7 +315,17 @@
           <w:color w:val="196B24" w:themeColor="accent3"/>
           <w:kern w:val="0"/>
         </w:rPr>
-        <w:t>Just the lower diagonal</w:t>
+        <w:t xml:space="preserve">Just the lower </w:t>
+      </w:r>
+      <w:r>
+        <w:rPr>
+          <w:rFonts w:ascii="Helvetica" w:hAnsi="Helvetica" w:cs="Helvetica"/>
+          <w:b/>
+          <w:bCs/>
+          <w:color w:val="196B24" w:themeColor="accent3"/>
+          <w:kern w:val="0"/>
+        </w:rPr>
+        <w:t>triangle</w:t>
       </w:r>
     </w:p>
     <w:p>
@@ -463,12 +473,16 @@
         <w:spacing w:after="0" w:line="240" w:lineRule="auto"/>
         <w:rPr>
           <w:rFonts w:ascii="Helvetica" w:hAnsi="Helvetica" w:cs="Helvetica"/>
-          <w:kern w:val="0"/>
-        </w:rPr>
-      </w:pPr>
-      <w:r>
-        <w:rPr>
-          <w:rFonts w:ascii="Helvetica" w:hAnsi="Helvetica" w:cs="Helvetica"/>
+          <w:b/>
+          <w:bCs/>
+          <w:kern w:val="0"/>
+        </w:rPr>
+      </w:pPr>
+      <w:r>
+        <w:rPr>
+          <w:rFonts w:ascii="Helvetica" w:hAnsi="Helvetica" w:cs="Helvetica"/>
+          <w:b/>
+          <w:bCs/>
           <w:kern w:val="0"/>
         </w:rPr>
         <w:t>Evaluate MEME OUT examples:</w:t>
@@ -677,12 +691,14 @@
         <w:ind w:hanging="720"/>
         <w:rPr>
           <w:rFonts w:ascii="Helvetica" w:hAnsi="Helvetica" w:cs="Helvetica"/>
-          <w:kern w:val="0"/>
-        </w:rPr>
-      </w:pPr>
-      <w:r>
-        <w:rPr>
-          <w:rFonts w:ascii="Helvetica" w:hAnsi="Helvetica" w:cs="Helvetica"/>
+          <w:color w:val="196B24" w:themeColor="accent3"/>
+          <w:kern w:val="0"/>
+        </w:rPr>
+      </w:pPr>
+      <w:r>
+        <w:rPr>
+          <w:rFonts w:ascii="Helvetica" w:hAnsi="Helvetica" w:cs="Helvetica"/>
+          <w:color w:val="196B24" w:themeColor="accent3"/>
           <w:kern w:val="0"/>
         </w:rPr>
         <w:t xml:space="preserve">Decrementing the percentile </w:t>
@@ -691,6 +707,7 @@
       <w:r>
         <w:rPr>
           <w:rFonts w:ascii="Helvetica" w:hAnsi="Helvetica" w:cs="Helvetica"/>
+          <w:color w:val="196B24" w:themeColor="accent3"/>
           <w:kern w:val="0"/>
         </w:rPr>
         <w:t>threshold  —</w:t>
@@ -699,9 +716,34 @@
       <w:r>
         <w:rPr>
           <w:rFonts w:ascii="Helvetica" w:hAnsi="Helvetica" w:cs="Helvetica"/>
+          <w:color w:val="196B24" w:themeColor="accent3"/>
           <w:kern w:val="0"/>
         </w:rPr>
         <w:t xml:space="preserve"> the user should do that, leave it alone and let it output just none.</w:t>
+      </w:r>
+      <w:r>
+        <w:rPr>
+          <w:rFonts w:ascii="Helvetica" w:hAnsi="Helvetica" w:cs="Helvetica"/>
+          <w:color w:val="196B24" w:themeColor="accent3"/>
+          <w:kern w:val="0"/>
+        </w:rPr>
+        <w:t xml:space="preserve"> </w:t>
+      </w:r>
+      <w:r>
+        <w:rPr>
+          <w:rFonts w:ascii="Helvetica" w:hAnsi="Helvetica" w:cs="Helvetica"/>
+          <w:color w:val="196B24" w:themeColor="accent3"/>
+          <w:kern w:val="0"/>
+        </w:rPr>
+        <w:sym w:font="Wingdings" w:char="F0E0"/>
+      </w:r>
+      <w:r>
+        <w:rPr>
+          <w:rFonts w:ascii="Helvetica" w:hAnsi="Helvetica" w:cs="Helvetica"/>
+          <w:color w:val="196B24" w:themeColor="accent3"/>
+          <w:kern w:val="0"/>
+        </w:rPr>
+        <w:t xml:space="preserve"> added togglable automatic override, default is set to True.</w:t>
       </w:r>
     </w:p>
     <w:p>
@@ -1660,6 +1702,7 @@
         <w:rPr>
           <w:rFonts w:ascii="Helvetica" w:hAnsi="Helvetica" w:cs="Helvetica"/>
           <w:kern w:val="0"/>
+          <w:lang w:val="es-ES_tradnl"/>
         </w:rPr>
       </w:pPr>
       <w:r>

</xml_diff>

<commit_message>
MEME xml analysis and reporting
</commit_message>
<xml_diff>
--- a/5-19-26.docx
+++ b/5-19-26.docx
@@ -137,6 +137,13 @@
         </w:rPr>
         <w:t>This might be a bad idea for cases like “ATAATA”</w:t>
       </w:r>
+      <w:r>
+        <w:rPr>
+          <w:rFonts w:ascii="Helvetica" w:hAnsi="Helvetica" w:cs="Helvetica"/>
+          <w:kern w:val="0"/>
+        </w:rPr>
+        <w:t>?</w:t>
+      </w:r>
     </w:p>
     <w:p>
       <w:pPr>
@@ -356,12 +363,18 @@
         <w:ind w:hanging="720"/>
         <w:rPr>
           <w:rFonts w:ascii="Helvetica" w:hAnsi="Helvetica" w:cs="Helvetica"/>
-          <w:kern w:val="0"/>
-        </w:rPr>
-      </w:pPr>
-      <w:r>
-        <w:rPr>
-          <w:rFonts w:ascii="Helvetica" w:hAnsi="Helvetica" w:cs="Helvetica"/>
+          <w:b/>
+          <w:bCs/>
+          <w:color w:val="196B24" w:themeColor="accent3"/>
+          <w:kern w:val="0"/>
+        </w:rPr>
+      </w:pPr>
+      <w:r>
+        <w:rPr>
+          <w:rFonts w:ascii="Helvetica" w:hAnsi="Helvetica" w:cs="Helvetica"/>
+          <w:b/>
+          <w:bCs/>
+          <w:color w:val="196B24" w:themeColor="accent3"/>
           <w:kern w:val="0"/>
         </w:rPr>
         <w:t xml:space="preserve">zero p-values = + 1 </w:t>
@@ -370,6 +383,9 @@
       <w:r>
         <w:rPr>
           <w:rFonts w:ascii="Helvetica" w:hAnsi="Helvetica" w:cs="Helvetica"/>
+          <w:b/>
+          <w:bCs/>
+          <w:color w:val="196B24" w:themeColor="accent3"/>
           <w:kern w:val="0"/>
         </w:rPr>
         <w:t>/(</w:t>
@@ -378,6 +394,9 @@
       <w:r>
         <w:rPr>
           <w:rFonts w:ascii="Helvetica" w:hAnsi="Helvetica" w:cs="Helvetica"/>
+          <w:b/>
+          <w:bCs/>
+          <w:color w:val="196B24" w:themeColor="accent3"/>
           <w:kern w:val="0"/>
         </w:rPr>
         <w:t xml:space="preserve">n </w:t>
@@ -386,6 +405,9 @@
       <w:r>
         <w:rPr>
           <w:rFonts w:ascii="Helvetica" w:hAnsi="Helvetica" w:cs="Helvetica"/>
+          <w:b/>
+          <w:bCs/>
+          <w:color w:val="196B24" w:themeColor="accent3"/>
           <w:kern w:val="0"/>
         </w:rPr>
         <w:t>+  2</w:t>
@@ -394,9 +416,101 @@
       <w:r>
         <w:rPr>
           <w:rFonts w:ascii="Helvetica" w:hAnsi="Helvetica" w:cs="Helvetica"/>
+          <w:b/>
+          <w:bCs/>
+          <w:color w:val="196B24" w:themeColor="accent3"/>
           <w:kern w:val="0"/>
         </w:rPr>
         <w:t xml:space="preserve">) in the denominator </w:t>
+      </w:r>
+    </w:p>
+    <w:p>
+      <w:pPr>
+        <w:numPr>
+          <w:ilvl w:val="1"/>
+          <w:numId w:val="1"/>
+        </w:numPr>
+        <w:tabs>
+          <w:tab w:val="left" w:pos="220"/>
+          <w:tab w:val="left" w:pos="720"/>
+          <w:tab w:val="left" w:pos="1440"/>
+          <w:tab w:val="left" w:pos="2160"/>
+          <w:tab w:val="left" w:pos="2880"/>
+          <w:tab w:val="left" w:pos="3600"/>
+          <w:tab w:val="left" w:pos="4320"/>
+          <w:tab w:val="left" w:pos="5040"/>
+          <w:tab w:val="left" w:pos="5760"/>
+          <w:tab w:val="left" w:pos="6480"/>
+          <w:tab w:val="left" w:pos="7200"/>
+          <w:tab w:val="left" w:pos="7920"/>
+          <w:tab w:val="left" w:pos="8640"/>
+        </w:tabs>
+        <w:autoSpaceDE w:val="0"/>
+        <w:autoSpaceDN w:val="0"/>
+        <w:adjustRightInd w:val="0"/>
+        <w:spacing w:after="0" w:line="240" w:lineRule="auto"/>
+        <w:ind w:left="720" w:hanging="720"/>
+        <w:rPr>
+          <w:rFonts w:ascii="Helvetica" w:hAnsi="Helvetica" w:cs="Helvetica"/>
+          <w:b/>
+          <w:bCs/>
+          <w:color w:val="196B24" w:themeColor="accent3"/>
+          <w:kern w:val="0"/>
+        </w:rPr>
+      </w:pPr>
+      <w:r>
+        <w:rPr>
+          <w:rFonts w:ascii="Helvetica" w:hAnsi="Helvetica" w:cs="Helvetica"/>
+          <w:b/>
+          <w:bCs/>
+          <w:color w:val="196B24" w:themeColor="accent3"/>
+          <w:kern w:val="0"/>
+        </w:rPr>
+        <w:t xml:space="preserve">These are answering different questions. The n+1 correction (Davison &amp; Hinkley / </w:t>
+      </w:r>
+      <w:proofErr w:type="spellStart"/>
+      <w:r>
+        <w:rPr>
+          <w:rFonts w:ascii="Helvetica" w:hAnsi="Helvetica" w:cs="Helvetica"/>
+          <w:b/>
+          <w:bCs/>
+          <w:color w:val="196B24" w:themeColor="accent3"/>
+          <w:kern w:val="0"/>
+        </w:rPr>
+        <w:t>Phipson</w:t>
+      </w:r>
+      <w:proofErr w:type="spellEnd"/>
+      <w:r>
+        <w:rPr>
+          <w:rFonts w:ascii="Helvetica" w:hAnsi="Helvetica" w:cs="Helvetica"/>
+          <w:b/>
+          <w:bCs/>
+          <w:color w:val="196B24" w:themeColor="accent3"/>
+          <w:kern w:val="0"/>
+        </w:rPr>
+        <w:t xml:space="preserve">) gives a valid frequentist p-value — it's the probability that a random permutation beats your score, with the observed statistic counted as part of its own reference set. The n+2 correction gives the best point estimate of what the true p-value </w:t>
+      </w:r>
+      <w:proofErr w:type="gramStart"/>
+      <w:r>
+        <w:rPr>
+          <w:rFonts w:ascii="Helvetica" w:hAnsi="Helvetica" w:cs="Helvetica"/>
+          <w:b/>
+          <w:bCs/>
+          <w:color w:val="196B24" w:themeColor="accent3"/>
+          <w:kern w:val="0"/>
+        </w:rPr>
+        <w:t>actually is</w:t>
+      </w:r>
+      <w:proofErr w:type="gramEnd"/>
+      <w:r>
+        <w:rPr>
+          <w:rFonts w:ascii="Helvetica" w:hAnsi="Helvetica" w:cs="Helvetica"/>
+          <w:b/>
+          <w:bCs/>
+          <w:color w:val="196B24" w:themeColor="accent3"/>
+          <w:kern w:val="0"/>
+        </w:rPr>
+        <w:t>, given what you observed and a flat prior.</w:t>
       </w:r>
     </w:p>
     <w:p>
@@ -1257,6 +1371,7 @@
           <w:rFonts w:ascii="Helvetica" w:hAnsi="Helvetica" w:cs="Helvetica"/>
           <w:kern w:val="0"/>
         </w:rPr>
+        <w:lastRenderedPageBreak/>
         <w:t xml:space="preserve">ROC of either the DR or the IR </w:t>
       </w:r>
     </w:p>
@@ -3460,7 +3575,6 @@
   <w:style w:type="character" w:default="1" w:styleId="DefaultParagraphFont">
     <w:name w:val="Default Paragraph Font"/>
     <w:uiPriority w:val="1"/>
-    <w:semiHidden/>
     <w:unhideWhenUsed/>
   </w:style>
   <w:style w:type="table" w:default="1" w:styleId="TableNormal">

</xml_diff>

<commit_message>
refresh collectf and meme reporting, roc-pr curvesç
</commit_message>
<xml_diff>
--- a/5-19-26.docx
+++ b/5-19-26.docx
@@ -222,31 +222,31 @@
         <w:spacing w:after="0" w:line="240" w:lineRule="auto"/>
         <w:rPr>
           <w:rFonts w:ascii="Helvetica" w:hAnsi="Helvetica" w:cs="Helvetica"/>
-          <w:kern w:val="0"/>
-        </w:rPr>
-      </w:pPr>
-      <w:r>
-        <w:rPr>
-          <w:rFonts w:ascii="Helvetica" w:hAnsi="Helvetica" w:cs="Helvetica"/>
-          <w:kern w:val="0"/>
-        </w:rPr>
-        <w:t xml:space="preserve">Fix </w:t>
-      </w:r>
-      <w:proofErr w:type="spellStart"/>
-      <w:r>
-        <w:rPr>
-          <w:rFonts w:ascii="Helvetica" w:hAnsi="Helvetica" w:cs="Helvetica"/>
-          <w:kern w:val="0"/>
-        </w:rPr>
-        <w:t>MapBack</w:t>
-      </w:r>
-      <w:proofErr w:type="spellEnd"/>
-      <w:r>
-        <w:rPr>
-          <w:rFonts w:ascii="Helvetica" w:hAnsi="Helvetica" w:cs="Helvetica"/>
-          <w:kern w:val="0"/>
-        </w:rPr>
-        <w:t xml:space="preserve"> for IR patterns</w:t>
+          <w:b/>
+          <w:bCs/>
+          <w:color w:val="196B24" w:themeColor="accent3"/>
+          <w:kern w:val="0"/>
+        </w:rPr>
+      </w:pPr>
+      <w:r>
+        <w:rPr>
+          <w:rFonts w:ascii="Helvetica" w:hAnsi="Helvetica" w:cs="Helvetica"/>
+          <w:b/>
+          <w:bCs/>
+          <w:color w:val="196B24" w:themeColor="accent3"/>
+          <w:kern w:val="0"/>
+        </w:rPr>
+        <w:t>Fix MapBack for IR patterns</w:t>
+      </w:r>
+      <w:r>
+        <w:rPr>
+          <w:rFonts w:ascii="Helvetica" w:hAnsi="Helvetica" w:cs="Helvetica"/>
+          <w:b/>
+          <w:bCs/>
+          <w:color w:val="196B24" w:themeColor="accent3"/>
+          <w:kern w:val="0"/>
+        </w:rPr>
+        <w:t xml:space="preserve"> (quality of life fix)</w:t>
       </w:r>
     </w:p>
     <w:p>
@@ -481,51 +481,7 @@
           <w:color w:val="196B24" w:themeColor="accent3"/>
           <w:kern w:val="0"/>
         </w:rPr>
-        <w:t xml:space="preserve">zero p-values = + 1 </w:t>
-      </w:r>
-      <w:proofErr w:type="gramStart"/>
-      <w:r>
-        <w:rPr>
-          <w:rFonts w:ascii="Helvetica" w:hAnsi="Helvetica" w:cs="Helvetica"/>
-          <w:b/>
-          <w:bCs/>
-          <w:color w:val="196B24" w:themeColor="accent3"/>
-          <w:kern w:val="0"/>
-        </w:rPr>
-        <w:t>/(</w:t>
-      </w:r>
-      <w:proofErr w:type="gramEnd"/>
-      <w:r>
-        <w:rPr>
-          <w:rFonts w:ascii="Helvetica" w:hAnsi="Helvetica" w:cs="Helvetica"/>
-          <w:b/>
-          <w:bCs/>
-          <w:color w:val="196B24" w:themeColor="accent3"/>
-          <w:kern w:val="0"/>
-        </w:rPr>
-        <w:t xml:space="preserve">n </w:t>
-      </w:r>
-      <w:proofErr w:type="gramStart"/>
-      <w:r>
-        <w:rPr>
-          <w:rFonts w:ascii="Helvetica" w:hAnsi="Helvetica" w:cs="Helvetica"/>
-          <w:b/>
-          <w:bCs/>
-          <w:color w:val="196B24" w:themeColor="accent3"/>
-          <w:kern w:val="0"/>
-        </w:rPr>
-        <w:t>+  2</w:t>
-      </w:r>
-      <w:proofErr w:type="gramEnd"/>
-      <w:r>
-        <w:rPr>
-          <w:rFonts w:ascii="Helvetica" w:hAnsi="Helvetica" w:cs="Helvetica"/>
-          <w:b/>
-          <w:bCs/>
-          <w:color w:val="196B24" w:themeColor="accent3"/>
-          <w:kern w:val="0"/>
-        </w:rPr>
-        <w:t xml:space="preserve">) in the denominator </w:t>
+        <w:t xml:space="preserve">zero p-values = + 1 /(n +  2) in the denominator </w:t>
       </w:r>
     </w:p>
     <w:p>
@@ -570,173 +526,96 @@
           <w:color w:val="196B24" w:themeColor="accent3"/>
           <w:kern w:val="0"/>
         </w:rPr>
-        <w:t xml:space="preserve">These are answering different questions. The n+1 correction (Davison &amp; Hinkley / </w:t>
-      </w:r>
-      <w:proofErr w:type="spellStart"/>
-      <w:r>
+        <w:t>These are answering different questions. The n+1 correction (Davison &amp; Hinkley / Phipson) gives a valid frequentist p-value — it's the probability that a random permutation beats your score, with the observed statistic counted as part of its own reference set. The n+2 correction gives the best point estimate of what the true p-value actually is, given what you observed and a flat prior.</w:t>
+      </w:r>
+    </w:p>
+    <w:p>
+      <w:pPr>
+        <w:tabs>
+          <w:tab w:val="left" w:pos="720"/>
+          <w:tab w:val="left" w:pos="1440"/>
+          <w:tab w:val="left" w:pos="2160"/>
+          <w:tab w:val="left" w:pos="2880"/>
+          <w:tab w:val="left" w:pos="3600"/>
+          <w:tab w:val="left" w:pos="4320"/>
+          <w:tab w:val="left" w:pos="5040"/>
+          <w:tab w:val="left" w:pos="5760"/>
+          <w:tab w:val="left" w:pos="6480"/>
+          <w:tab w:val="left" w:pos="7200"/>
+          <w:tab w:val="left" w:pos="7920"/>
+          <w:tab w:val="left" w:pos="8640"/>
+        </w:tabs>
+        <w:autoSpaceDE w:val="0"/>
+        <w:autoSpaceDN w:val="0"/>
+        <w:adjustRightInd w:val="0"/>
+        <w:spacing w:after="0" w:line="240" w:lineRule="auto"/>
+        <w:rPr>
+          <w:rFonts w:ascii="Helvetica" w:hAnsi="Helvetica" w:cs="Helvetica"/>
+          <w:kern w:val="0"/>
+        </w:rPr>
+      </w:pPr>
+    </w:p>
+    <w:p>
+      <w:pPr>
+        <w:tabs>
+          <w:tab w:val="left" w:pos="720"/>
+          <w:tab w:val="left" w:pos="1440"/>
+          <w:tab w:val="left" w:pos="2160"/>
+          <w:tab w:val="left" w:pos="2880"/>
+          <w:tab w:val="left" w:pos="3600"/>
+          <w:tab w:val="left" w:pos="4320"/>
+          <w:tab w:val="left" w:pos="5040"/>
+          <w:tab w:val="left" w:pos="5760"/>
+          <w:tab w:val="left" w:pos="6480"/>
+          <w:tab w:val="left" w:pos="7200"/>
+          <w:tab w:val="left" w:pos="7920"/>
+          <w:tab w:val="left" w:pos="8640"/>
+        </w:tabs>
+        <w:autoSpaceDE w:val="0"/>
+        <w:autoSpaceDN w:val="0"/>
+        <w:adjustRightInd w:val="0"/>
+        <w:spacing w:after="0" w:line="240" w:lineRule="auto"/>
+        <w:rPr>
+          <w:rFonts w:ascii="Helvetica" w:hAnsi="Helvetica" w:cs="Helvetica"/>
+          <w:kern w:val="0"/>
+        </w:rPr>
+      </w:pPr>
+    </w:p>
+    <w:p>
+      <w:pPr>
+        <w:tabs>
+          <w:tab w:val="left" w:pos="720"/>
+          <w:tab w:val="left" w:pos="1440"/>
+          <w:tab w:val="left" w:pos="2160"/>
+          <w:tab w:val="left" w:pos="2880"/>
+          <w:tab w:val="left" w:pos="3600"/>
+          <w:tab w:val="left" w:pos="4320"/>
+          <w:tab w:val="left" w:pos="5040"/>
+          <w:tab w:val="left" w:pos="5760"/>
+          <w:tab w:val="left" w:pos="6480"/>
+          <w:tab w:val="left" w:pos="7200"/>
+          <w:tab w:val="left" w:pos="7920"/>
+          <w:tab w:val="left" w:pos="8640"/>
+        </w:tabs>
+        <w:autoSpaceDE w:val="0"/>
+        <w:autoSpaceDN w:val="0"/>
+        <w:adjustRightInd w:val="0"/>
+        <w:spacing w:after="0" w:line="240" w:lineRule="auto"/>
         <w:rPr>
           <w:rFonts w:ascii="Helvetica" w:hAnsi="Helvetica" w:cs="Helvetica"/>
           <w:b/>
           <w:bCs/>
-          <w:color w:val="196B24" w:themeColor="accent3"/>
-          <w:kern w:val="0"/>
-        </w:rPr>
-        <w:t>Phipson</w:t>
-      </w:r>
-      <w:proofErr w:type="spellEnd"/>
+          <w:kern w:val="0"/>
+        </w:rPr>
+      </w:pPr>
       <w:r>
         <w:rPr>
           <w:rFonts w:ascii="Helvetica" w:hAnsi="Helvetica" w:cs="Helvetica"/>
           <w:b/>
           <w:bCs/>
-          <w:color w:val="196B24" w:themeColor="accent3"/>
-          <w:kern w:val="0"/>
-        </w:rPr>
-        <w:t xml:space="preserve">) gives a valid frequentist p-value — it's the probability that a random permutation beats your score, with the observed statistic counted as part of its own reference set. The n+2 correction gives the best point estimate of what the true p-value </w:t>
-      </w:r>
-      <w:proofErr w:type="gramStart"/>
-      <w:r>
-        <w:rPr>
-          <w:rFonts w:ascii="Helvetica" w:hAnsi="Helvetica" w:cs="Helvetica"/>
-          <w:b/>
-          <w:bCs/>
-          <w:color w:val="196B24" w:themeColor="accent3"/>
-          <w:kern w:val="0"/>
-        </w:rPr>
-        <w:t>actually is</w:t>
-      </w:r>
-      <w:proofErr w:type="gramEnd"/>
-      <w:r>
-        <w:rPr>
-          <w:rFonts w:ascii="Helvetica" w:hAnsi="Helvetica" w:cs="Helvetica"/>
-          <w:b/>
-          <w:bCs/>
-          <w:color w:val="196B24" w:themeColor="accent3"/>
-          <w:kern w:val="0"/>
-        </w:rPr>
-        <w:t>, given what you observed and a flat prior.</w:t>
-      </w:r>
-    </w:p>
-    <w:p>
-      <w:pPr>
-        <w:tabs>
-          <w:tab w:val="left" w:pos="720"/>
-          <w:tab w:val="left" w:pos="1440"/>
-          <w:tab w:val="left" w:pos="2160"/>
-          <w:tab w:val="left" w:pos="2880"/>
-          <w:tab w:val="left" w:pos="3600"/>
-          <w:tab w:val="left" w:pos="4320"/>
-          <w:tab w:val="left" w:pos="5040"/>
-          <w:tab w:val="left" w:pos="5760"/>
-          <w:tab w:val="left" w:pos="6480"/>
-          <w:tab w:val="left" w:pos="7200"/>
-          <w:tab w:val="left" w:pos="7920"/>
-          <w:tab w:val="left" w:pos="8640"/>
-        </w:tabs>
-        <w:autoSpaceDE w:val="0"/>
-        <w:autoSpaceDN w:val="0"/>
-        <w:adjustRightInd w:val="0"/>
-        <w:spacing w:after="0" w:line="240" w:lineRule="auto"/>
-        <w:rPr>
-          <w:rFonts w:ascii="Helvetica" w:hAnsi="Helvetica" w:cs="Helvetica"/>
-          <w:kern w:val="0"/>
-        </w:rPr>
-      </w:pPr>
-    </w:p>
-    <w:p>
-      <w:pPr>
-        <w:tabs>
-          <w:tab w:val="left" w:pos="720"/>
-          <w:tab w:val="left" w:pos="1440"/>
-          <w:tab w:val="left" w:pos="2160"/>
-          <w:tab w:val="left" w:pos="2880"/>
-          <w:tab w:val="left" w:pos="3600"/>
-          <w:tab w:val="left" w:pos="4320"/>
-          <w:tab w:val="left" w:pos="5040"/>
-          <w:tab w:val="left" w:pos="5760"/>
-          <w:tab w:val="left" w:pos="6480"/>
-          <w:tab w:val="left" w:pos="7200"/>
-          <w:tab w:val="left" w:pos="7920"/>
-          <w:tab w:val="left" w:pos="8640"/>
-        </w:tabs>
-        <w:autoSpaceDE w:val="0"/>
-        <w:autoSpaceDN w:val="0"/>
-        <w:adjustRightInd w:val="0"/>
-        <w:spacing w:after="0" w:line="240" w:lineRule="auto"/>
-        <w:rPr>
-          <w:rFonts w:ascii="Helvetica" w:hAnsi="Helvetica" w:cs="Helvetica"/>
-          <w:kern w:val="0"/>
-        </w:rPr>
-      </w:pPr>
-    </w:p>
-    <w:p>
-      <w:pPr>
-        <w:tabs>
-          <w:tab w:val="left" w:pos="720"/>
-          <w:tab w:val="left" w:pos="1440"/>
-          <w:tab w:val="left" w:pos="2160"/>
-          <w:tab w:val="left" w:pos="2880"/>
-          <w:tab w:val="left" w:pos="3600"/>
-          <w:tab w:val="left" w:pos="4320"/>
-          <w:tab w:val="left" w:pos="5040"/>
-          <w:tab w:val="left" w:pos="5760"/>
-          <w:tab w:val="left" w:pos="6480"/>
-          <w:tab w:val="left" w:pos="7200"/>
-          <w:tab w:val="left" w:pos="7920"/>
-          <w:tab w:val="left" w:pos="8640"/>
-        </w:tabs>
-        <w:autoSpaceDE w:val="0"/>
-        <w:autoSpaceDN w:val="0"/>
-        <w:adjustRightInd w:val="0"/>
-        <w:spacing w:after="0" w:line="240" w:lineRule="auto"/>
-        <w:rPr>
-          <w:rFonts w:ascii="Helvetica" w:hAnsi="Helvetica" w:cs="Helvetica"/>
-          <w:b/>
-          <w:bCs/>
-          <w:kern w:val="0"/>
-        </w:rPr>
-      </w:pPr>
-      <w:r>
-        <w:rPr>
-          <w:rFonts w:ascii="Helvetica" w:hAnsi="Helvetica" w:cs="Helvetica"/>
-          <w:b/>
-          <w:bCs/>
-          <w:kern w:val="0"/>
-        </w:rPr>
-        <w:t>Evaluate MEME OUT examples:</w:t>
-      </w:r>
-    </w:p>
-    <w:p>
-      <w:pPr>
-        <w:tabs>
-          <w:tab w:val="left" w:pos="720"/>
-          <w:tab w:val="left" w:pos="1440"/>
-          <w:tab w:val="left" w:pos="2160"/>
-          <w:tab w:val="left" w:pos="2880"/>
-          <w:tab w:val="left" w:pos="3600"/>
-          <w:tab w:val="left" w:pos="4320"/>
-          <w:tab w:val="left" w:pos="5040"/>
-          <w:tab w:val="left" w:pos="5760"/>
-          <w:tab w:val="left" w:pos="6480"/>
-          <w:tab w:val="left" w:pos="7200"/>
-          <w:tab w:val="left" w:pos="7920"/>
-          <w:tab w:val="left" w:pos="8640"/>
-        </w:tabs>
-        <w:autoSpaceDE w:val="0"/>
-        <w:autoSpaceDN w:val="0"/>
-        <w:adjustRightInd w:val="0"/>
-        <w:spacing w:after="0" w:line="240" w:lineRule="auto"/>
-        <w:rPr>
-          <w:rFonts w:ascii="Helvetica" w:hAnsi="Helvetica" w:cs="Helvetica"/>
-          <w:kern w:val="0"/>
-        </w:rPr>
-      </w:pPr>
-      <w:r>
-        <w:rPr>
-          <w:rFonts w:ascii="Helvetica" w:hAnsi="Helvetica" w:cs="Helvetica"/>
-          <w:kern w:val="0"/>
-        </w:rPr>
-        <w:t xml:space="preserve"> </w:t>
+          <w:kern w:val="0"/>
+        </w:rPr>
+        <w:t>Evaluate MEME OUT examples</w:t>
       </w:r>
     </w:p>
     <w:p>
@@ -866,20 +745,8 @@
           <w:color w:val="196B24" w:themeColor="accent3"/>
           <w:kern w:val="0"/>
         </w:rPr>
-        <w:t xml:space="preserve">Fix the inconsistent lengths — grab aligned from </w:t>
-      </w:r>
-      <w:proofErr w:type="spellStart"/>
-      <w:r>
-        <w:rPr>
-          <w:rFonts w:ascii="Helvetica" w:hAnsi="Helvetica" w:cs="Helvetica"/>
-          <w:b/>
-          <w:bCs/>
-          <w:color w:val="196B24" w:themeColor="accent3"/>
-          <w:kern w:val="0"/>
-        </w:rPr>
-        <w:t>CollecTF</w:t>
-      </w:r>
-      <w:proofErr w:type="spellEnd"/>
+        <w:t>Fix the inconsistent lengths — grab aligned from CollecTF</w:t>
+      </w:r>
     </w:p>
     <w:p>
       <w:pPr>
@@ -919,25 +786,7 @@
           <w:color w:val="196B24" w:themeColor="accent3"/>
           <w:kern w:val="0"/>
         </w:rPr>
-        <w:t xml:space="preserve">Decrementing the percentile </w:t>
-      </w:r>
-      <w:proofErr w:type="gramStart"/>
-      <w:r>
-        <w:rPr>
-          <w:rFonts w:ascii="Helvetica" w:hAnsi="Helvetica" w:cs="Helvetica"/>
-          <w:color w:val="196B24" w:themeColor="accent3"/>
-          <w:kern w:val="0"/>
-        </w:rPr>
-        <w:t>threshold  —</w:t>
-      </w:r>
-      <w:proofErr w:type="gramEnd"/>
-      <w:r>
-        <w:rPr>
-          <w:rFonts w:ascii="Helvetica" w:hAnsi="Helvetica" w:cs="Helvetica"/>
-          <w:color w:val="196B24" w:themeColor="accent3"/>
-          <w:kern w:val="0"/>
-        </w:rPr>
-        <w:t xml:space="preserve"> the user should do that, leave it alone and let it output just none.</w:t>
+        <w:t>Decrementing the percentile threshold  — the user should do that, leave it alone and let it output just none.</w:t>
       </w:r>
       <w:r>
         <w:rPr>
@@ -1268,23 +1117,7 @@
           <w:rFonts w:ascii="Helvetica" w:hAnsi="Helvetica" w:cs="Helvetica"/>
           <w:kern w:val="0"/>
         </w:rPr>
-        <w:t>Show the distribution of the -log(</w:t>
-      </w:r>
-      <w:proofErr w:type="spellStart"/>
-      <w:r>
-        <w:rPr>
-          <w:rFonts w:ascii="Helvetica" w:hAnsi="Helvetica" w:cs="Helvetica"/>
-          <w:kern w:val="0"/>
-        </w:rPr>
-        <w:t>pval</w:t>
-      </w:r>
-      <w:proofErr w:type="spellEnd"/>
-      <w:r>
-        <w:rPr>
-          <w:rFonts w:ascii="Helvetica" w:hAnsi="Helvetica" w:cs="Helvetica"/>
-          <w:kern w:val="0"/>
-        </w:rPr>
-        <w:t xml:space="preserve">)  </w:t>
+        <w:t xml:space="preserve">Show the distribution of the -log(pval)  </w:t>
       </w:r>
     </w:p>
     <w:p>
@@ -1514,48 +1347,7 @@
           <w:rFonts w:ascii="Helvetica" w:hAnsi="Helvetica" w:cs="Helvetica"/>
           <w:kern w:val="0"/>
         </w:rPr>
-        <w:t xml:space="preserve">or </w:t>
-      </w:r>
-      <w:proofErr w:type="gramStart"/>
-      <w:r>
-        <w:rPr>
-          <w:rFonts w:ascii="Helvetica" w:hAnsi="Helvetica" w:cs="Helvetica"/>
-          <w:kern w:val="0"/>
-        </w:rPr>
-        <w:t>min(</w:t>
-      </w:r>
-      <w:proofErr w:type="spellStart"/>
-      <w:proofErr w:type="gramEnd"/>
-      <w:r>
-        <w:rPr>
-          <w:rFonts w:ascii="Helvetica" w:hAnsi="Helvetica" w:cs="Helvetica"/>
-          <w:kern w:val="0"/>
-        </w:rPr>
-        <w:t>DRpval</w:t>
-      </w:r>
-      <w:proofErr w:type="spellEnd"/>
-      <w:r>
-        <w:rPr>
-          <w:rFonts w:ascii="Helvetica" w:hAnsi="Helvetica" w:cs="Helvetica"/>
-          <w:kern w:val="0"/>
-        </w:rPr>
-        <w:t xml:space="preserve">, </w:t>
-      </w:r>
-      <w:proofErr w:type="spellStart"/>
-      <w:r>
-        <w:rPr>
-          <w:rFonts w:ascii="Helvetica" w:hAnsi="Helvetica" w:cs="Helvetica"/>
-          <w:kern w:val="0"/>
-        </w:rPr>
-        <w:t>IRpval</w:t>
-      </w:r>
-      <w:proofErr w:type="spellEnd"/>
-      <w:r>
-        <w:rPr>
-          <w:rFonts w:ascii="Helvetica" w:hAnsi="Helvetica" w:cs="Helvetica"/>
-          <w:kern w:val="0"/>
-        </w:rPr>
-        <w:t>)</w:t>
+        <w:t>or min(DRpval, IRpval)</w:t>
       </w:r>
     </w:p>
     <w:p>
@@ -1956,31 +1748,13 @@
           <w:kern w:val="0"/>
         </w:rPr>
       </w:pPr>
-      <w:proofErr w:type="spellStart"/>
-      <w:r>
-        <w:rPr>
-          <w:rFonts w:ascii="Helvetica" w:hAnsi="Helvetica" w:cs="Helvetica"/>
-          <w:kern w:val="0"/>
-        </w:rPr>
-        <w:t>RNASeq</w:t>
-      </w:r>
-      <w:proofErr w:type="spellEnd"/>
-      <w:r>
-        <w:rPr>
-          <w:rFonts w:ascii="Helvetica" w:hAnsi="Helvetica" w:cs="Helvetica"/>
-          <w:kern w:val="0"/>
-        </w:rPr>
-        <w:t xml:space="preserve"> - </w:t>
-      </w:r>
-      <w:proofErr w:type="spellStart"/>
-      <w:r>
-        <w:rPr>
-          <w:rFonts w:ascii="Helvetica" w:hAnsi="Helvetica" w:cs="Helvetica"/>
-          <w:kern w:val="0"/>
-        </w:rPr>
-        <w:t>ChIPSeq</w:t>
-      </w:r>
-      <w:proofErr w:type="spellEnd"/>
+      <w:r>
+        <w:rPr>
+          <w:rFonts w:ascii="Helvetica" w:hAnsi="Helvetica" w:cs="Helvetica"/>
+          <w:kern w:val="0"/>
+        </w:rPr>
+        <w:t>RNASeq - ChIPSeq</w:t>
+      </w:r>
     </w:p>
     <w:p>
       <w:pPr>
@@ -2164,264 +1938,184 @@
           <w:rFonts w:ascii="Helvetica" w:hAnsi="Helvetica" w:cs="Helvetica"/>
           <w:kern w:val="0"/>
         </w:rPr>
-        <w:t xml:space="preserve">* </w:t>
-      </w:r>
-      <w:proofErr w:type="gramStart"/>
-      <w:r>
-        <w:rPr>
-          <w:rFonts w:ascii="Helvetica" w:hAnsi="Helvetica" w:cs="Helvetica"/>
-          <w:kern w:val="0"/>
-        </w:rPr>
-        <w:t>our</w:t>
-      </w:r>
-      <w:proofErr w:type="gramEnd"/>
-      <w:r>
-        <w:rPr>
-          <w:rFonts w:ascii="Helvetica" w:hAnsi="Helvetica" w:cs="Helvetica"/>
-          <w:kern w:val="0"/>
-        </w:rPr>
-        <w:t xml:space="preserve"> base assumption of a dimeric (or tetrameric) binding conformation and use that to evaluate the candidate patterns </w:t>
-      </w:r>
-    </w:p>
-    <w:p>
-      <w:pPr>
-        <w:tabs>
-          <w:tab w:val="left" w:pos="720"/>
-          <w:tab w:val="left" w:pos="1440"/>
-          <w:tab w:val="left" w:pos="2160"/>
-          <w:tab w:val="left" w:pos="2880"/>
-          <w:tab w:val="left" w:pos="3600"/>
-          <w:tab w:val="left" w:pos="4320"/>
-          <w:tab w:val="left" w:pos="5040"/>
-          <w:tab w:val="left" w:pos="5760"/>
-          <w:tab w:val="left" w:pos="6480"/>
-          <w:tab w:val="left" w:pos="7200"/>
-          <w:tab w:val="left" w:pos="7920"/>
-          <w:tab w:val="left" w:pos="8640"/>
-        </w:tabs>
-        <w:autoSpaceDE w:val="0"/>
-        <w:autoSpaceDN w:val="0"/>
-        <w:adjustRightInd w:val="0"/>
-        <w:spacing w:after="0" w:line="240" w:lineRule="auto"/>
-        <w:rPr>
-          <w:rFonts w:ascii="Helvetica" w:hAnsi="Helvetica" w:cs="Helvetica"/>
-          <w:kern w:val="0"/>
-        </w:rPr>
-      </w:pPr>
-    </w:p>
-    <w:p>
-      <w:pPr>
-        <w:tabs>
-          <w:tab w:val="left" w:pos="720"/>
-          <w:tab w:val="left" w:pos="1440"/>
-          <w:tab w:val="left" w:pos="2160"/>
-          <w:tab w:val="left" w:pos="2880"/>
-          <w:tab w:val="left" w:pos="3600"/>
-          <w:tab w:val="left" w:pos="4320"/>
-          <w:tab w:val="left" w:pos="5040"/>
-          <w:tab w:val="left" w:pos="5760"/>
-          <w:tab w:val="left" w:pos="6480"/>
-          <w:tab w:val="left" w:pos="7200"/>
-          <w:tab w:val="left" w:pos="7920"/>
-          <w:tab w:val="left" w:pos="8640"/>
-        </w:tabs>
-        <w:autoSpaceDE w:val="0"/>
-        <w:autoSpaceDN w:val="0"/>
-        <w:adjustRightInd w:val="0"/>
-        <w:spacing w:after="0" w:line="240" w:lineRule="auto"/>
-        <w:rPr>
-          <w:rFonts w:ascii="Helvetica" w:hAnsi="Helvetica" w:cs="Helvetica"/>
-          <w:kern w:val="0"/>
-        </w:rPr>
-      </w:pPr>
-      <w:r>
-        <w:rPr>
-          <w:rFonts w:ascii="Helvetica" w:hAnsi="Helvetica" w:cs="Helvetica"/>
-          <w:kern w:val="0"/>
-        </w:rPr>
-        <w:t xml:space="preserve">* </w:t>
-      </w:r>
-      <w:proofErr w:type="gramStart"/>
-      <w:r>
-        <w:rPr>
-          <w:rFonts w:ascii="Helvetica" w:hAnsi="Helvetica" w:cs="Helvetica"/>
-          <w:kern w:val="0"/>
-        </w:rPr>
-        <w:t>we</w:t>
-      </w:r>
-      <w:proofErr w:type="gramEnd"/>
-      <w:r>
-        <w:rPr>
-          <w:rFonts w:ascii="Helvetica" w:hAnsi="Helvetica" w:cs="Helvetica"/>
-          <w:kern w:val="0"/>
-        </w:rPr>
-        <w:t xml:space="preserve"> have some downstream outputs from motif discovery, how can we automate the evaluation of whether the motif is an actual binding site or </w:t>
-      </w:r>
-      <w:proofErr w:type="gramStart"/>
-      <w:r>
-        <w:rPr>
-          <w:rFonts w:ascii="Helvetica" w:hAnsi="Helvetica" w:cs="Helvetica"/>
-          <w:kern w:val="0"/>
-        </w:rPr>
-        <w:t>not ?</w:t>
-      </w:r>
-      <w:proofErr w:type="gramEnd"/>
-      <w:r>
-        <w:rPr>
-          <w:rFonts w:ascii="Helvetica" w:hAnsi="Helvetica" w:cs="Helvetica"/>
-          <w:kern w:val="0"/>
-        </w:rPr>
-        <w:t xml:space="preserve"> </w:t>
-      </w:r>
-    </w:p>
-    <w:p>
-      <w:pPr>
-        <w:tabs>
-          <w:tab w:val="left" w:pos="720"/>
-          <w:tab w:val="left" w:pos="1440"/>
-          <w:tab w:val="left" w:pos="2160"/>
-          <w:tab w:val="left" w:pos="2880"/>
-          <w:tab w:val="left" w:pos="3600"/>
-          <w:tab w:val="left" w:pos="4320"/>
-          <w:tab w:val="left" w:pos="5040"/>
-          <w:tab w:val="left" w:pos="5760"/>
-          <w:tab w:val="left" w:pos="6480"/>
-          <w:tab w:val="left" w:pos="7200"/>
-          <w:tab w:val="left" w:pos="7920"/>
-          <w:tab w:val="left" w:pos="8640"/>
-        </w:tabs>
-        <w:autoSpaceDE w:val="0"/>
-        <w:autoSpaceDN w:val="0"/>
-        <w:adjustRightInd w:val="0"/>
-        <w:spacing w:after="0" w:line="240" w:lineRule="auto"/>
-        <w:rPr>
-          <w:rFonts w:ascii="Helvetica" w:hAnsi="Helvetica" w:cs="Helvetica"/>
-          <w:kern w:val="0"/>
-        </w:rPr>
-      </w:pPr>
-    </w:p>
-    <w:p>
-      <w:pPr>
-        <w:tabs>
-          <w:tab w:val="left" w:pos="720"/>
-          <w:tab w:val="left" w:pos="1440"/>
-          <w:tab w:val="left" w:pos="2160"/>
-          <w:tab w:val="left" w:pos="2880"/>
-          <w:tab w:val="left" w:pos="3600"/>
-          <w:tab w:val="left" w:pos="4320"/>
-          <w:tab w:val="left" w:pos="5040"/>
-          <w:tab w:val="left" w:pos="5760"/>
-          <w:tab w:val="left" w:pos="6480"/>
-          <w:tab w:val="left" w:pos="7200"/>
-          <w:tab w:val="left" w:pos="7920"/>
-          <w:tab w:val="left" w:pos="8640"/>
-        </w:tabs>
-        <w:autoSpaceDE w:val="0"/>
-        <w:autoSpaceDN w:val="0"/>
-        <w:adjustRightInd w:val="0"/>
-        <w:spacing w:after="0" w:line="240" w:lineRule="auto"/>
-        <w:rPr>
-          <w:rFonts w:ascii="Helvetica" w:hAnsi="Helvetica" w:cs="Helvetica"/>
-          <w:kern w:val="0"/>
-        </w:rPr>
-      </w:pPr>
-    </w:p>
-    <w:p>
-      <w:pPr>
-        <w:tabs>
-          <w:tab w:val="left" w:pos="720"/>
-          <w:tab w:val="left" w:pos="1440"/>
-          <w:tab w:val="left" w:pos="2160"/>
-          <w:tab w:val="left" w:pos="2880"/>
-          <w:tab w:val="left" w:pos="3600"/>
-          <w:tab w:val="left" w:pos="4320"/>
-          <w:tab w:val="left" w:pos="5040"/>
-          <w:tab w:val="left" w:pos="5760"/>
-          <w:tab w:val="left" w:pos="6480"/>
-          <w:tab w:val="left" w:pos="7200"/>
-          <w:tab w:val="left" w:pos="7920"/>
-          <w:tab w:val="left" w:pos="8640"/>
-        </w:tabs>
-        <w:autoSpaceDE w:val="0"/>
-        <w:autoSpaceDN w:val="0"/>
-        <w:adjustRightInd w:val="0"/>
-        <w:spacing w:after="0" w:line="240" w:lineRule="auto"/>
-        <w:rPr>
-          <w:rFonts w:ascii="Helvetica" w:hAnsi="Helvetica" w:cs="Helvetica"/>
-          <w:kern w:val="0"/>
-        </w:rPr>
-      </w:pPr>
-      <w:r>
-        <w:rPr>
-          <w:rFonts w:ascii="Helvetica" w:hAnsi="Helvetica" w:cs="Helvetica"/>
-          <w:kern w:val="0"/>
-        </w:rPr>
-        <w:t xml:space="preserve">* </w:t>
-      </w:r>
-      <w:proofErr w:type="gramStart"/>
-      <w:r>
-        <w:rPr>
-          <w:rFonts w:ascii="Helvetica" w:hAnsi="Helvetica" w:cs="Helvetica"/>
-          <w:kern w:val="0"/>
-        </w:rPr>
-        <w:t>other</w:t>
-      </w:r>
-      <w:proofErr w:type="gramEnd"/>
-      <w:r>
-        <w:rPr>
-          <w:rFonts w:ascii="Helvetica" w:hAnsi="Helvetica" w:cs="Helvetica"/>
-          <w:kern w:val="0"/>
-        </w:rPr>
-        <w:t xml:space="preserve"> ways to evaluate a motif candidate — coverage in the genome </w:t>
-      </w:r>
-    </w:p>
-    <w:p>
-      <w:pPr>
-        <w:tabs>
-          <w:tab w:val="left" w:pos="720"/>
-          <w:tab w:val="left" w:pos="1440"/>
-          <w:tab w:val="left" w:pos="2160"/>
-          <w:tab w:val="left" w:pos="2880"/>
-          <w:tab w:val="left" w:pos="3600"/>
-          <w:tab w:val="left" w:pos="4320"/>
-          <w:tab w:val="left" w:pos="5040"/>
-          <w:tab w:val="left" w:pos="5760"/>
-          <w:tab w:val="left" w:pos="6480"/>
-          <w:tab w:val="left" w:pos="7200"/>
-          <w:tab w:val="left" w:pos="7920"/>
-          <w:tab w:val="left" w:pos="8640"/>
-        </w:tabs>
-        <w:autoSpaceDE w:val="0"/>
-        <w:autoSpaceDN w:val="0"/>
-        <w:adjustRightInd w:val="0"/>
-        <w:spacing w:after="0" w:line="240" w:lineRule="auto"/>
-        <w:rPr>
-          <w:rFonts w:ascii="Helvetica" w:hAnsi="Helvetica" w:cs="Helvetica"/>
-          <w:kern w:val="0"/>
-        </w:rPr>
-      </w:pPr>
-      <w:r>
-        <w:rPr>
-          <w:rFonts w:ascii="Helvetica" w:hAnsi="Helvetica" w:cs="Helvetica"/>
-          <w:kern w:val="0"/>
-        </w:rPr>
-        <w:t xml:space="preserve">* </w:t>
-      </w:r>
-      <w:proofErr w:type="gramStart"/>
-      <w:r>
-        <w:rPr>
-          <w:rFonts w:ascii="Helvetica" w:hAnsi="Helvetica" w:cs="Helvetica"/>
-          <w:kern w:val="0"/>
-        </w:rPr>
-        <w:t>the</w:t>
-      </w:r>
-      <w:proofErr w:type="gramEnd"/>
-      <w:r>
-        <w:rPr>
-          <w:rFonts w:ascii="Helvetica" w:hAnsi="Helvetica" w:cs="Helvetica"/>
-          <w:kern w:val="0"/>
-        </w:rPr>
-        <w:t xml:space="preserve"> problem is that many things are conserved and statistically significant, but the conservation does not necessarily denote an actual binding site </w:t>
+        <w:t xml:space="preserve">* our base assumption of a dimeric (or tetrameric) binding conformation and use that to evaluate the candidate patterns </w:t>
+      </w:r>
+    </w:p>
+    <w:p>
+      <w:pPr>
+        <w:tabs>
+          <w:tab w:val="left" w:pos="720"/>
+          <w:tab w:val="left" w:pos="1440"/>
+          <w:tab w:val="left" w:pos="2160"/>
+          <w:tab w:val="left" w:pos="2880"/>
+          <w:tab w:val="left" w:pos="3600"/>
+          <w:tab w:val="left" w:pos="4320"/>
+          <w:tab w:val="left" w:pos="5040"/>
+          <w:tab w:val="left" w:pos="5760"/>
+          <w:tab w:val="left" w:pos="6480"/>
+          <w:tab w:val="left" w:pos="7200"/>
+          <w:tab w:val="left" w:pos="7920"/>
+          <w:tab w:val="left" w:pos="8640"/>
+        </w:tabs>
+        <w:autoSpaceDE w:val="0"/>
+        <w:autoSpaceDN w:val="0"/>
+        <w:adjustRightInd w:val="0"/>
+        <w:spacing w:after="0" w:line="240" w:lineRule="auto"/>
+        <w:rPr>
+          <w:rFonts w:ascii="Helvetica" w:hAnsi="Helvetica" w:cs="Helvetica"/>
+          <w:kern w:val="0"/>
+        </w:rPr>
+      </w:pPr>
+    </w:p>
+    <w:p>
+      <w:pPr>
+        <w:tabs>
+          <w:tab w:val="left" w:pos="720"/>
+          <w:tab w:val="left" w:pos="1440"/>
+          <w:tab w:val="left" w:pos="2160"/>
+          <w:tab w:val="left" w:pos="2880"/>
+          <w:tab w:val="left" w:pos="3600"/>
+          <w:tab w:val="left" w:pos="4320"/>
+          <w:tab w:val="left" w:pos="5040"/>
+          <w:tab w:val="left" w:pos="5760"/>
+          <w:tab w:val="left" w:pos="6480"/>
+          <w:tab w:val="left" w:pos="7200"/>
+          <w:tab w:val="left" w:pos="7920"/>
+          <w:tab w:val="left" w:pos="8640"/>
+        </w:tabs>
+        <w:autoSpaceDE w:val="0"/>
+        <w:autoSpaceDN w:val="0"/>
+        <w:adjustRightInd w:val="0"/>
+        <w:spacing w:after="0" w:line="240" w:lineRule="auto"/>
+        <w:rPr>
+          <w:rFonts w:ascii="Helvetica" w:hAnsi="Helvetica" w:cs="Helvetica"/>
+          <w:kern w:val="0"/>
+        </w:rPr>
+      </w:pPr>
+      <w:r>
+        <w:rPr>
+          <w:rFonts w:ascii="Helvetica" w:hAnsi="Helvetica" w:cs="Helvetica"/>
+          <w:kern w:val="0"/>
+        </w:rPr>
+        <w:t xml:space="preserve">* we have some downstream outputs from motif discovery, how can we automate the evaluation of whether the motif is an actual binding site or not ? </w:t>
+      </w:r>
+    </w:p>
+    <w:p>
+      <w:pPr>
+        <w:tabs>
+          <w:tab w:val="left" w:pos="720"/>
+          <w:tab w:val="left" w:pos="1440"/>
+          <w:tab w:val="left" w:pos="2160"/>
+          <w:tab w:val="left" w:pos="2880"/>
+          <w:tab w:val="left" w:pos="3600"/>
+          <w:tab w:val="left" w:pos="4320"/>
+          <w:tab w:val="left" w:pos="5040"/>
+          <w:tab w:val="left" w:pos="5760"/>
+          <w:tab w:val="left" w:pos="6480"/>
+          <w:tab w:val="left" w:pos="7200"/>
+          <w:tab w:val="left" w:pos="7920"/>
+          <w:tab w:val="left" w:pos="8640"/>
+        </w:tabs>
+        <w:autoSpaceDE w:val="0"/>
+        <w:autoSpaceDN w:val="0"/>
+        <w:adjustRightInd w:val="0"/>
+        <w:spacing w:after="0" w:line="240" w:lineRule="auto"/>
+        <w:rPr>
+          <w:rFonts w:ascii="Helvetica" w:hAnsi="Helvetica" w:cs="Helvetica"/>
+          <w:kern w:val="0"/>
+        </w:rPr>
+      </w:pPr>
+    </w:p>
+    <w:p>
+      <w:pPr>
+        <w:tabs>
+          <w:tab w:val="left" w:pos="720"/>
+          <w:tab w:val="left" w:pos="1440"/>
+          <w:tab w:val="left" w:pos="2160"/>
+          <w:tab w:val="left" w:pos="2880"/>
+          <w:tab w:val="left" w:pos="3600"/>
+          <w:tab w:val="left" w:pos="4320"/>
+          <w:tab w:val="left" w:pos="5040"/>
+          <w:tab w:val="left" w:pos="5760"/>
+          <w:tab w:val="left" w:pos="6480"/>
+          <w:tab w:val="left" w:pos="7200"/>
+          <w:tab w:val="left" w:pos="7920"/>
+          <w:tab w:val="left" w:pos="8640"/>
+        </w:tabs>
+        <w:autoSpaceDE w:val="0"/>
+        <w:autoSpaceDN w:val="0"/>
+        <w:adjustRightInd w:val="0"/>
+        <w:spacing w:after="0" w:line="240" w:lineRule="auto"/>
+        <w:rPr>
+          <w:rFonts w:ascii="Helvetica" w:hAnsi="Helvetica" w:cs="Helvetica"/>
+          <w:kern w:val="0"/>
+        </w:rPr>
+      </w:pPr>
+    </w:p>
+    <w:p>
+      <w:pPr>
+        <w:tabs>
+          <w:tab w:val="left" w:pos="720"/>
+          <w:tab w:val="left" w:pos="1440"/>
+          <w:tab w:val="left" w:pos="2160"/>
+          <w:tab w:val="left" w:pos="2880"/>
+          <w:tab w:val="left" w:pos="3600"/>
+          <w:tab w:val="left" w:pos="4320"/>
+          <w:tab w:val="left" w:pos="5040"/>
+          <w:tab w:val="left" w:pos="5760"/>
+          <w:tab w:val="left" w:pos="6480"/>
+          <w:tab w:val="left" w:pos="7200"/>
+          <w:tab w:val="left" w:pos="7920"/>
+          <w:tab w:val="left" w:pos="8640"/>
+        </w:tabs>
+        <w:autoSpaceDE w:val="0"/>
+        <w:autoSpaceDN w:val="0"/>
+        <w:adjustRightInd w:val="0"/>
+        <w:spacing w:after="0" w:line="240" w:lineRule="auto"/>
+        <w:rPr>
+          <w:rFonts w:ascii="Helvetica" w:hAnsi="Helvetica" w:cs="Helvetica"/>
+          <w:kern w:val="0"/>
+        </w:rPr>
+      </w:pPr>
+      <w:r>
+        <w:rPr>
+          <w:rFonts w:ascii="Helvetica" w:hAnsi="Helvetica" w:cs="Helvetica"/>
+          <w:kern w:val="0"/>
+        </w:rPr>
+        <w:t xml:space="preserve">* other ways to evaluate a motif candidate — coverage in the genome </w:t>
+      </w:r>
+    </w:p>
+    <w:p>
+      <w:pPr>
+        <w:tabs>
+          <w:tab w:val="left" w:pos="720"/>
+          <w:tab w:val="left" w:pos="1440"/>
+          <w:tab w:val="left" w:pos="2160"/>
+          <w:tab w:val="left" w:pos="2880"/>
+          <w:tab w:val="left" w:pos="3600"/>
+          <w:tab w:val="left" w:pos="4320"/>
+          <w:tab w:val="left" w:pos="5040"/>
+          <w:tab w:val="left" w:pos="5760"/>
+          <w:tab w:val="left" w:pos="6480"/>
+          <w:tab w:val="left" w:pos="7200"/>
+          <w:tab w:val="left" w:pos="7920"/>
+          <w:tab w:val="left" w:pos="8640"/>
+        </w:tabs>
+        <w:autoSpaceDE w:val="0"/>
+        <w:autoSpaceDN w:val="0"/>
+        <w:adjustRightInd w:val="0"/>
+        <w:spacing w:after="0" w:line="240" w:lineRule="auto"/>
+        <w:rPr>
+          <w:rFonts w:ascii="Helvetica" w:hAnsi="Helvetica" w:cs="Helvetica"/>
+          <w:kern w:val="0"/>
+        </w:rPr>
+      </w:pPr>
+      <w:r>
+        <w:rPr>
+          <w:rFonts w:ascii="Helvetica" w:hAnsi="Helvetica" w:cs="Helvetica"/>
+          <w:kern w:val="0"/>
+        </w:rPr>
+        <w:t xml:space="preserve">* the problem is that many things are conserved and statistically significant, but the conservation does not necessarily denote an actual binding site </w:t>
       </w:r>
     </w:p>
     <w:p>
@@ -2492,23 +2186,7 @@
           <w:rFonts w:ascii="Helvetica" w:hAnsi="Helvetica" w:cs="Helvetica"/>
           <w:kern w:val="0"/>
         </w:rPr>
-        <w:t xml:space="preserve">for our case of the bacterial transcription </w:t>
-      </w:r>
-      <w:proofErr w:type="gramStart"/>
-      <w:r>
-        <w:rPr>
-          <w:rFonts w:ascii="Helvetica" w:hAnsi="Helvetica" w:cs="Helvetica"/>
-          <w:kern w:val="0"/>
-        </w:rPr>
-        <w:t>factors</w:t>
-      </w:r>
-      <w:proofErr w:type="gramEnd"/>
-      <w:r>
-        <w:rPr>
-          <w:rFonts w:ascii="Helvetica" w:hAnsi="Helvetica" w:cs="Helvetica"/>
-          <w:kern w:val="0"/>
-        </w:rPr>
-        <w:t xml:space="preserve"> we use the base heuristic that the IR/DR  </w:t>
+        <w:t xml:space="preserve">for our case of the bacterial transcription factors we use the base heuristic that the IR/DR  </w:t>
       </w:r>
     </w:p>
     <w:p>
@@ -2571,23 +2249,7 @@
           <w:rFonts w:ascii="Helvetica" w:hAnsi="Helvetica" w:cs="Helvetica"/>
           <w:kern w:val="0"/>
         </w:rPr>
-        <w:t xml:space="preserve">* include the </w:t>
-      </w:r>
-      <w:proofErr w:type="spellStart"/>
-      <w:r>
-        <w:rPr>
-          <w:rFonts w:ascii="Helvetica" w:hAnsi="Helvetica" w:cs="Helvetica"/>
-          <w:kern w:val="0"/>
-        </w:rPr>
-        <w:t>CollecTF</w:t>
-      </w:r>
-      <w:proofErr w:type="spellEnd"/>
-      <w:r>
-        <w:rPr>
-          <w:rFonts w:ascii="Helvetica" w:hAnsi="Helvetica" w:cs="Helvetica"/>
-          <w:kern w:val="0"/>
-        </w:rPr>
-        <w:t xml:space="preserve"> — </w:t>
+        <w:t xml:space="preserve">* include the CollecTF — </w:t>
       </w:r>
       <w:hyperlink r:id="rId7" w:history="1">
         <w:r>

</xml_diff>